<commit_message>
feat(core): SEO updates, technical debt API, UX improvements
</commit_message>
<xml_diff>
--- a/SOGIS_Guide_Utilisation.docx
+++ b/SOGIS_Guide_Utilisation.docx
@@ -517,6 +517,46 @@
           <w:sz w:val="22"/>
         </w:rPr>
         <w:t>La plateforme web SOGIS est l'interface digitale officielle de l'entreprise. Elle permet aux clients et prospects de soumettre leurs demandes en ligne, de suivre l'avancement de leurs dossiers, de déposer des avis, et aux administrateurs de gérer l'ensemble de ces interactions depuis un tableau de bord sécurisé.</w:t>
+      </w:r>
+    </w:p>
+    <w:p>
+      <w:pPr>
+        <w:spacing w:before="200" w:after="200"/>
+        <w:jc w:val="center"/>
+      </w:pPr>
+      <w:r>
+        <w:drawing>
+          <wp:inline xmlns:a="http://schemas.openxmlformats.org/drawingml/2006/main" xmlns:pic="http://schemas.openxmlformats.org/drawingml/2006/picture">
+            <wp:extent cx="5760000" cy="2670000"/>
+            <wp:docPr id="1" name="Picture 1"/>
+            <wp:cNvGraphicFramePr>
+              <a:graphicFrameLocks noChangeAspect="1"/>
+            </wp:cNvGraphicFramePr>
+            <a:graphic>
+              <a:graphicData uri="http://schemas.openxmlformats.org/drawingml/2006/picture">
+                <pic:pic>
+                  <pic:nvPicPr>
+                    <pic:cNvPr id="0" name="full_page_with_logo_1778364203261.png"/>
+                    <pic:cNvPicPr/>
+                  </pic:nvPicPr>
+                  <pic:blipFill>
+                    <a:blip r:embed="rId9"/>
+                    <a:stretch>
+                      <a:fillRect/>
+                    </a:stretch>
+                  </pic:blipFill>
+                  <pic:spPr>
+                    <a:xfrm>
+                      <a:off x="0" y="0"/>
+                      <a:ext cx="5760000" cy="2670000"/>
+                    </a:xfrm>
+                    <a:prstGeom prst="rect"/>
+                  </pic:spPr>
+                </pic:pic>
+              </a:graphicData>
+            </a:graphic>
+          </wp:inline>
+        </w:drawing>
       </w:r>
     </w:p>
     <w:p>
@@ -3838,6 +3878,46 @@
     </w:p>
     <w:p>
       <w:pPr>
+        <w:spacing w:before="200" w:after="200"/>
+        <w:jc w:val="center"/>
+      </w:pPr>
+      <w:r>
+        <w:drawing>
+          <wp:inline xmlns:a="http://schemas.openxmlformats.org/drawingml/2006/main" xmlns:pic="http://schemas.openxmlformats.org/drawingml/2006/picture">
+            <wp:extent cx="5760000" cy="2670000"/>
+            <wp:docPr id="2" name="Picture 2"/>
+            <wp:cNvGraphicFramePr>
+              <a:graphicFrameLocks noChangeAspect="1"/>
+            </wp:cNvGraphicFramePr>
+            <a:graphic>
+              <a:graphicData uri="http://schemas.openxmlformats.org/drawingml/2006/picture">
+                <pic:pic>
+                  <pic:nvPicPr>
+                    <pic:cNvPr id="0" name="admin_login_page_1778363790446.png"/>
+                    <pic:cNvPicPr/>
+                  </pic:nvPicPr>
+                  <pic:blipFill>
+                    <a:blip r:embed="rId10"/>
+                    <a:stretch>
+                      <a:fillRect/>
+                    </a:stretch>
+                  </pic:blipFill>
+                  <pic:spPr>
+                    <a:xfrm>
+                      <a:off x="0" y="0"/>
+                      <a:ext cx="5760000" cy="2670000"/>
+                    </a:xfrm>
+                    <a:prstGeom prst="rect"/>
+                  </pic:spPr>
+                </pic:pic>
+              </a:graphicData>
+            </a:graphic>
+          </wp:inline>
+        </w:drawing>
+      </w:r>
+    </w:p>
+    <w:p>
+      <w:pPr>
         <w:pStyle w:val="Heading2"/>
         <w:spacing w:before="280" w:after="120"/>
         <w:jc w:val="left"/>
@@ -3863,6 +3943,46 @@
           <w:sz w:val="22"/>
         </w:rPr>
         <w:t>L'onglet "Demandes" est l'onglet par défaut du tableau de bord. Il liste toutes les demandes clients reçues, avec leurs informations complètes.</w:t>
+      </w:r>
+    </w:p>
+    <w:p>
+      <w:pPr>
+        <w:spacing w:before="200" w:after="200"/>
+        <w:jc w:val="center"/>
+      </w:pPr>
+      <w:r>
+        <w:drawing>
+          <wp:inline xmlns:a="http://schemas.openxmlformats.org/drawingml/2006/main" xmlns:pic="http://schemas.openxmlformats.org/drawingml/2006/picture">
+            <wp:extent cx="5760000" cy="2670000"/>
+            <wp:docPr id="3" name="Picture 3"/>
+            <wp:cNvGraphicFramePr>
+              <a:graphicFrameLocks noChangeAspect="1"/>
+            </wp:cNvGraphicFramePr>
+            <a:graphic>
+              <a:graphicData uri="http://schemas.openxmlformats.org/drawingml/2006/picture">
+                <pic:pic>
+                  <pic:nvPicPr>
+                    <pic:cNvPr id="0" name="admin_dashboard_after_login_1778363910160.png"/>
+                    <pic:cNvPicPr/>
+                  </pic:nvPicPr>
+                  <pic:blipFill>
+                    <a:blip r:embed="rId11"/>
+                    <a:stretch>
+                      <a:fillRect/>
+                    </a:stretch>
+                  </pic:blipFill>
+                  <pic:spPr>
+                    <a:xfrm>
+                      <a:off x="0" y="0"/>
+                      <a:ext cx="5760000" cy="2670000"/>
+                    </a:xfrm>
+                    <a:prstGeom prst="rect"/>
+                  </pic:spPr>
+                </pic:pic>
+              </a:graphicData>
+            </a:graphic>
+          </wp:inline>
+        </w:drawing>
       </w:r>
     </w:p>
     <w:p>

</xml_diff>